<commit_message>
fix: ajusta diagramas da entrega 2
</commit_message>
<xml_diff>
--- a/docs/entrega-2/academia-conectada-entrega-2.docx
+++ b/docs/entrega-2/academia-conectada-entrega-2.docx
@@ -3084,7 +3084,7 @@
       <w:r>
         <w:drawing>
           <wp:inline xmlns:a="http://schemas.openxmlformats.org/drawingml/2006/main" xmlns:pic="http://schemas.openxmlformats.org/drawingml/2006/picture">
-            <wp:extent cx="6035040" cy="3960495"/>
+            <wp:extent cx="6035040" cy="4073652"/>
             <wp:docPr id="1" name="Picture 1"/>
             <wp:cNvGraphicFramePr>
               <a:graphicFrameLocks noChangeAspect="1"/>
@@ -3105,7 +3105,7 @@
                   <pic:spPr>
                     <a:xfrm>
                       <a:off x="0" y="0"/>
-                      <a:ext cx="6035040" cy="3960495"/>
+                      <a:ext cx="6035040" cy="4073652"/>
                     </a:xfrm>
                     <a:prstGeom prst="rect"/>
                   </pic:spPr>
@@ -4790,7 +4790,7 @@
       <w:r>
         <w:drawing>
           <wp:inline xmlns:a="http://schemas.openxmlformats.org/drawingml/2006/main" xmlns:pic="http://schemas.openxmlformats.org/drawingml/2006/picture">
-            <wp:extent cx="6126480" cy="4144384"/>
+            <wp:extent cx="6126480" cy="4288536"/>
             <wp:docPr id="6" name="Picture 6"/>
             <wp:cNvGraphicFramePr>
               <a:graphicFrameLocks noChangeAspect="1"/>
@@ -4811,7 +4811,7 @@
                   <pic:spPr>
                     <a:xfrm>
                       <a:off x="0" y="0"/>
-                      <a:ext cx="6126480" cy="4144384"/>
+                      <a:ext cx="6126480" cy="4288536"/>
                     </a:xfrm>
                     <a:prstGeom prst="rect"/>
                   </pic:spPr>

</xml_diff>